<commit_message>
Started Drafting the Interim Plan
</commit_message>
<xml_diff>
--- a/Project2/Reports/Interim Data Analysis Plan.docx
+++ b/Project2/Reports/Interim Data Analysis Plan.docx
@@ -18,39 +18,279 @@
       </w:r>
     </w:p>
     <w:p>
-      <w:r>
-        <w:t xml:space="preserve">Aim 1: </w:t>
-      </w:r>
-      <w:r>
-        <w:t>Evaluate longitudinal associations between markers of peripheral inflammation,</w:t>
-      </w:r>
-      <w:r>
+      <w:pPr>
+        <w:rPr>
+          <w:b/>
+          <w:bCs/>
+        </w:rPr>
+      </w:pPr>
+      <w:r>
+        <w:rPr>
+          <w:b/>
+          <w:bCs/>
+        </w:rPr>
+        <w:t>Aim 1: Evaluate longitudinal associations between markers of peripheral inflammation,</w:t>
+      </w:r>
+      <w:r>
+        <w:rPr>
+          <w:b/>
+          <w:bCs/>
+        </w:rPr>
         <w:t xml:space="preserve"> </w:t>
       </w:r>
       <w:r>
+        <w:rPr>
+          <w:b/>
+          <w:bCs/>
+        </w:rPr>
         <w:t>cognition, and brain structure in aMCI</w:t>
       </w:r>
       <w:r>
+        <w:rPr>
+          <w:b/>
+          <w:bCs/>
+        </w:rPr>
         <w:t>.</w:t>
+      </w:r>
+    </w:p>
+    <w:p>
+      <w:r>
+        <w:t>Hypothesis 1a: Higher baseline inflammatory markers</w:t>
+      </w:r>
+      <w:r>
+        <w:t xml:space="preserve"> levels</w:t>
+      </w:r>
+      <w:r>
+        <w:t xml:space="preserve"> are associated with </w:t>
+      </w:r>
+      <w:r>
+        <w:t xml:space="preserve">greater decline in episodic memory and </w:t>
+      </w:r>
+      <w:r>
+        <w:t>AD</w:t>
+      </w:r>
+      <w:r>
+        <w:t>-</w:t>
+      </w:r>
+      <w:r>
+        <w:t xml:space="preserve">signature </w:t>
+      </w:r>
+      <w:r>
+        <w:t xml:space="preserve">cortical thickness </w:t>
+      </w:r>
+      <w:r>
+        <w:t>over 1 year</w:t>
+      </w:r>
+      <w:r>
+        <w:t>.</w:t>
+      </w:r>
+    </w:p>
+    <w:p>
+      <w:r>
+        <w:t xml:space="preserve">Hypothesis 1b: </w:t>
+      </w:r>
+      <w:r>
+        <w:t>Greater i</w:t>
+      </w:r>
+      <w:r>
+        <w:t xml:space="preserve">ncreases in inflammatory markers over time </w:t>
+      </w:r>
+      <w:r>
+        <w:t>are</w:t>
+      </w:r>
+      <w:r>
+        <w:t xml:space="preserve"> associated with greater decline in episodic memory and cortical thickness</w:t>
+      </w:r>
+      <w:r>
+        <w:t xml:space="preserve"> over 1 year</w:t>
+      </w:r>
+      <w:r>
+        <w:t>.</w:t>
+      </w:r>
+    </w:p>
+    <w:p>
+      <w:r>
+        <w:t>Outcomes:</w:t>
+      </w:r>
+      <w:r>
+        <w:t xml:space="preserve"> Outcomes</w:t>
+      </w:r>
+      <w:r>
+        <w:t xml:space="preserve"> are change scores (baseline to year 1)</w:t>
+      </w:r>
+      <w:r>
+        <w:t xml:space="preserve"> from Table 3</w:t>
+      </w:r>
+      <w:r>
+        <w:t xml:space="preserve"> and </w:t>
+      </w:r>
+      <w:r>
+        <w:t>mean AD</w:t>
+      </w:r>
+      <w:r>
+        <w:t>-</w:t>
+      </w:r>
+      <w:r>
+        <w:t>signature cortical thickness.</w:t>
+      </w:r>
+    </w:p>
+    <w:p>
+      <w:pPr>
+        <w:tabs>
+          <w:tab w:val="left" w:pos="5808"/>
+        </w:tabs>
+      </w:pPr>
+      <w:r>
+        <w:t>Predictors:</w:t>
+      </w:r>
+      <w:r>
+        <w:t xml:space="preserve"> IL</w:t>
+      </w:r>
+      <w:r>
+        <w:t>-</w:t>
+      </w:r>
+      <w:r>
+        <w:t xml:space="preserve">6, TNF </w:t>
+      </w:r>
+      <w:r>
+        <w:t>-</w:t>
+      </w:r>
+      <w:r>
+        <w:t xml:space="preserve"> alpha, MCP-1, Eotaxin-1</w:t>
+      </w:r>
+      <w:r>
+        <w:t xml:space="preserve"> as primary markers</w:t>
+      </w:r>
+      <w:r>
+        <w:t>, others exploratory</w:t>
+      </w:r>
+    </w:p>
+    <w:p>
+      <w:r>
+        <w:t xml:space="preserve">Approach: </w:t>
+      </w:r>
+    </w:p>
+    <w:p>
+      <w:r>
+        <w:t>Other variables:</w:t>
+      </w:r>
+      <w:r>
+        <w:t xml:space="preserve"> </w:t>
+      </w:r>
+      <w:r>
+        <w:t xml:space="preserve">All models will be adjusted for </w:t>
+      </w:r>
+      <w:r>
+        <w:t>age</w:t>
+      </w:r>
+      <w:r>
+        <w:t xml:space="preserve"> and</w:t>
+      </w:r>
+      <w:r>
+        <w:t xml:space="preserve"> sex</w:t>
+      </w:r>
+      <w:r>
+        <w:t>.</w:t>
+      </w:r>
+      <w:r>
+        <w:t xml:space="preserve"> Variables</w:t>
+      </w:r>
+      <w:r>
+        <w:t xml:space="preserve"> like</w:t>
+      </w:r>
+      <w:r>
+        <w:t xml:space="preserve"> APOE</w:t>
+      </w:r>
+      <w:r>
+        <w:t xml:space="preserve"> </w:t>
+      </w:r>
+      <w:r>
+        <w:t>genotype</w:t>
+      </w:r>
+      <w:r>
+        <w:t>, BMI, blood pressure, history of hypercholesterolemia, NSAID use, CDR severity, Geriatric Depression Scale score, and immune-relevant health history conditions</w:t>
+      </w:r>
+      <w:r>
+        <w:t xml:space="preserve"> will be treated as confounders or precision variables </w:t>
+      </w:r>
+      <w:r>
+        <w:t>depending on their relationships.</w:t>
+      </w:r>
+    </w:p>
+    <w:p>
+      <w:r>
+        <w:t>Power:</w:t>
+      </w:r>
+      <w:r>
+        <w:t xml:space="preserve"> </w:t>
       </w:r>
     </w:p>
     <w:p/>
-    <w:p/>
     <w:p>
-      <w:r>
+      <w:pPr>
+        <w:rPr>
+          <w:b/>
+          <w:bCs/>
+        </w:rPr>
+      </w:pPr>
+      <w:r>
+        <w:rPr>
+          <w:b/>
+          <w:bCs/>
+        </w:rPr>
         <w:t>Aim 2:</w:t>
       </w:r>
       <w:r>
-        <w:t xml:space="preserve"> </w:t>
-      </w:r>
-      <w:r>
-        <w:t>Examine how markers of peripheral inflammation impact the relationship between</w:t>
-      </w:r>
-      <w:r>
-        <w:t xml:space="preserve"> </w:t>
-      </w:r>
-      <w:r>
-        <w:t>AD pathology and clinical progression of aMCI.</w:t>
+        <w:rPr>
+          <w:b/>
+          <w:bCs/>
+        </w:rPr>
+        <w:t xml:space="preserve"> Examine how markers of peripheral inflammation impact the relationship between AD pathology and clinical progression of aMCI.</w:t>
+      </w:r>
+    </w:p>
+    <w:p>
+      <w:r>
+        <w:t xml:space="preserve">Hypothesis: </w:t>
+      </w:r>
+      <w:r>
+        <w:t>T</w:t>
+      </w:r>
+      <w:r>
+        <w:t>he combination of elevated inflammatory markers and high amyloid deposition will more strongly predict decline in episodic memory and AD</w:t>
+      </w:r>
+      <w:r>
+        <w:t>-</w:t>
+      </w:r>
+      <w:r>
+        <w:t>signature cortical thickness than either variable alone</w:t>
+      </w:r>
+      <w:r>
+        <w:t>.</w:t>
+      </w:r>
+    </w:p>
+    <w:p>
+      <w:r>
+        <w:t>Outcomes:</w:t>
+      </w:r>
+    </w:p>
+    <w:p>
+      <w:r>
+        <w:t>Predictors:</w:t>
+      </w:r>
+    </w:p>
+    <w:p>
+      <w:r>
+        <w:t xml:space="preserve">Approach: </w:t>
+      </w:r>
+    </w:p>
+    <w:p>
+      <w:r>
+        <w:t>Other variables:</w:t>
+      </w:r>
+    </w:p>
+    <w:p>
+      <w:r>
+        <w:t>Power:</w:t>
       </w:r>
     </w:p>
     <w:p/>

</xml_diff>

<commit_message>
Drafted the final interim data analysis plan
</commit_message>
<xml_diff>
--- a/Project2/Reports/Interim Data Analysis Plan.docx
+++ b/Project2/Reports/Interim Data Analysis Plan.docx
@@ -4,13 +4,25 @@
   <w:body>
     <w:p>
       <w:pPr>
-        <w:rPr>
+        <w:spacing w:line="480" w:lineRule="auto"/>
+        <w:jc w:val="both"/>
+        <w:rPr>
+          <w:rFonts w:ascii="Times New Roman" w:hAnsi="Times New Roman" w:cs="Times New Roman"/>
           <w:b/>
           <w:bCs/>
         </w:rPr>
       </w:pPr>
       <w:r>
         <w:rPr>
+          <w:rFonts w:ascii="Times New Roman" w:hAnsi="Times New Roman" w:cs="Times New Roman"/>
+          <w:b/>
+          <w:bCs/>
+        </w:rPr>
+        <w:t xml:space="preserve">Interim </w:t>
+      </w:r>
+      <w:r>
+        <w:rPr>
+          <w:rFonts w:ascii="Times New Roman" w:hAnsi="Times New Roman" w:cs="Times New Roman"/>
           <w:b/>
           <w:bCs/>
         </w:rPr>
@@ -19,13 +31,17 @@
     </w:p>
     <w:p>
       <w:pPr>
-        <w:rPr>
+        <w:spacing w:line="480" w:lineRule="auto"/>
+        <w:jc w:val="both"/>
+        <w:rPr>
+          <w:rFonts w:ascii="Times New Roman" w:hAnsi="Times New Roman" w:cs="Times New Roman"/>
           <w:b/>
           <w:bCs/>
         </w:rPr>
       </w:pPr>
       <w:r>
         <w:rPr>
+          <w:rFonts w:ascii="Times New Roman" w:hAnsi="Times New Roman" w:cs="Times New Roman"/>
           <w:b/>
           <w:bCs/>
         </w:rPr>
@@ -33,6 +49,7 @@
       </w:r>
       <w:r>
         <w:rPr>
+          <w:rFonts w:ascii="Times New Roman" w:hAnsi="Times New Roman" w:cs="Times New Roman"/>
           <w:b/>
           <w:bCs/>
         </w:rPr>
@@ -40,6 +57,7 @@
       </w:r>
       <w:r>
         <w:rPr>
+          <w:rFonts w:ascii="Times New Roman" w:hAnsi="Times New Roman" w:cs="Times New Roman"/>
           <w:b/>
           <w:bCs/>
         </w:rPr>
@@ -47,253 +65,1011 @@
       </w:r>
       <w:r>
         <w:rPr>
+          <w:rFonts w:ascii="Times New Roman" w:hAnsi="Times New Roman" w:cs="Times New Roman"/>
           <w:b/>
           <w:bCs/>
         </w:rPr>
         <w:t>.</w:t>
-      </w:r>
-    </w:p>
-    <w:p>
-      <w:r>
-        <w:t>Hypothesis 1a: Higher baseline inflammatory markers</w:t>
-      </w:r>
-      <w:r>
-        <w:t xml:space="preserve"> levels</w:t>
-      </w:r>
-      <w:r>
-        <w:t xml:space="preserve"> are associated with </w:t>
-      </w:r>
-      <w:r>
-        <w:t xml:space="preserve">greater decline in episodic memory and </w:t>
-      </w:r>
-      <w:r>
-        <w:t>AD</w:t>
-      </w:r>
-      <w:r>
-        <w:t>-</w:t>
-      </w:r>
-      <w:r>
-        <w:t xml:space="preserve">signature </w:t>
-      </w:r>
-      <w:r>
-        <w:t xml:space="preserve">cortical thickness </w:t>
-      </w:r>
-      <w:r>
-        <w:t>over 1 year</w:t>
-      </w:r>
-      <w:r>
-        <w:t>.</w:t>
-      </w:r>
-    </w:p>
-    <w:p>
-      <w:r>
-        <w:t xml:space="preserve">Hypothesis 1b: </w:t>
-      </w:r>
-      <w:r>
-        <w:t>Greater i</w:t>
-      </w:r>
-      <w:r>
-        <w:t xml:space="preserve">ncreases in inflammatory markers over time </w:t>
-      </w:r>
-      <w:r>
-        <w:t>are</w:t>
-      </w:r>
-      <w:r>
-        <w:t xml:space="preserve"> associated with greater decline in episodic memory and cortical thickness</w:t>
-      </w:r>
-      <w:r>
-        <w:t xml:space="preserve"> over 1 year</w:t>
-      </w:r>
-      <w:r>
-        <w:t>.</w:t>
-      </w:r>
-    </w:p>
-    <w:p>
-      <w:r>
-        <w:t>Outcomes:</w:t>
-      </w:r>
-      <w:r>
-        <w:t xml:space="preserve"> Outcomes</w:t>
-      </w:r>
-      <w:r>
-        <w:t xml:space="preserve"> are change scores (baseline to year 1)</w:t>
-      </w:r>
-      <w:r>
-        <w:t xml:space="preserve"> from Table 3</w:t>
-      </w:r>
-      <w:r>
-        <w:t xml:space="preserve"> and </w:t>
-      </w:r>
-      <w:r>
-        <w:t>mean AD</w:t>
-      </w:r>
-      <w:r>
-        <w:t>-</w:t>
-      </w:r>
-      <w:r>
-        <w:t>signature cortical thickness.</w:t>
       </w:r>
     </w:p>
     <w:p>
       <w:pPr>
-        <w:tabs>
-          <w:tab w:val="left" w:pos="5808"/>
-        </w:tabs>
+        <w:spacing w:line="480" w:lineRule="auto"/>
+        <w:jc w:val="both"/>
+        <w:rPr>
+          <w:rFonts w:ascii="Times New Roman" w:hAnsi="Times New Roman" w:cs="Times New Roman"/>
+          <w:b/>
+          <w:bCs/>
+        </w:rPr>
       </w:pPr>
       <w:r>
-        <w:t>Predictors:</w:t>
-      </w:r>
-      <w:r>
-        <w:t xml:space="preserve"> IL</w:t>
-      </w:r>
-      <w:r>
-        <w:t>-</w:t>
-      </w:r>
-      <w:r>
-        <w:t xml:space="preserve">6, TNF </w:t>
-      </w:r>
-      <w:r>
-        <w:t>-</w:t>
-      </w:r>
-      <w:r>
-        <w:t xml:space="preserve"> alpha, MCP-1, Eotaxin-1</w:t>
-      </w:r>
-      <w:r>
-        <w:t xml:space="preserve"> as primary markers</w:t>
-      </w:r>
-      <w:r>
-        <w:t>, others exploratory</w:t>
+        <w:rPr>
+          <w:rFonts w:ascii="Times New Roman" w:hAnsi="Times New Roman" w:cs="Times New Roman"/>
+          <w:b/>
+          <w:bCs/>
+        </w:rPr>
+        <w:t>Hypothesis</w:t>
+      </w:r>
+      <w:r>
+        <w:rPr>
+          <w:rFonts w:ascii="Times New Roman" w:hAnsi="Times New Roman" w:cs="Times New Roman"/>
+          <w:b/>
+          <w:bCs/>
+        </w:rPr>
+        <w:t xml:space="preserve"> and</w:t>
+      </w:r>
+      <w:r>
+        <w:rPr>
+          <w:rFonts w:ascii="Times New Roman" w:hAnsi="Times New Roman" w:cs="Times New Roman"/>
+          <w:b/>
+          <w:bCs/>
+        </w:rPr>
+        <w:t xml:space="preserve"> outcomes:</w:t>
       </w:r>
     </w:p>
     <w:p>
-      <w:r>
-        <w:t xml:space="preserve">Approach: </w:t>
+      <w:pPr>
+        <w:spacing w:line="480" w:lineRule="auto"/>
+        <w:jc w:val="both"/>
+        <w:rPr>
+          <w:rFonts w:ascii="Times New Roman" w:hAnsi="Times New Roman" w:cs="Times New Roman"/>
+          <w:b/>
+          <w:bCs/>
+        </w:rPr>
+      </w:pPr>
+      <w:r>
+        <w:rPr>
+          <w:rFonts w:ascii="Times New Roman" w:hAnsi="Times New Roman" w:cs="Times New Roman"/>
+        </w:rPr>
+        <w:t>Hypothesis 1a</w:t>
+      </w:r>
+      <w:r>
+        <w:rPr>
+          <w:rFonts w:ascii="Times New Roman" w:hAnsi="Times New Roman" w:cs="Times New Roman"/>
+        </w:rPr>
+        <w:t>: Higher baseline levels of four inflammatory markers</w:t>
+      </w:r>
+      <w:r>
+        <w:rPr>
+          <w:rFonts w:ascii="Times New Roman" w:hAnsi="Times New Roman" w:cs="Times New Roman"/>
+        </w:rPr>
+        <w:t xml:space="preserve"> (</w:t>
+      </w:r>
+      <w:r>
+        <w:rPr>
+          <w:rFonts w:ascii="Times New Roman" w:hAnsi="Times New Roman" w:cs="Times New Roman"/>
+        </w:rPr>
+        <w:t>IL-6, TNF - alpha, MCP-1, Eotaxin-1)</w:t>
+      </w:r>
+      <w:r>
+        <w:rPr>
+          <w:rFonts w:ascii="Times New Roman" w:hAnsi="Times New Roman" w:cs="Times New Roman"/>
+        </w:rPr>
+        <w:t xml:space="preserve"> </w:t>
+      </w:r>
+      <w:r>
+        <w:rPr>
+          <w:rFonts w:ascii="Times New Roman" w:hAnsi="Times New Roman" w:cs="Times New Roman"/>
+        </w:rPr>
+        <w:t>will predict greater decline in episodic memory consolidation and</w:t>
+      </w:r>
+      <w:r>
+        <w:rPr>
+          <w:rFonts w:ascii="Times New Roman" w:hAnsi="Times New Roman" w:cs="Times New Roman"/>
+        </w:rPr>
+        <w:t xml:space="preserve"> </w:t>
+      </w:r>
+      <w:r>
+        <w:rPr>
+          <w:rFonts w:ascii="Times New Roman" w:hAnsi="Times New Roman" w:cs="Times New Roman"/>
+        </w:rPr>
+        <w:t>decrease</w:t>
+      </w:r>
+      <w:r>
+        <w:rPr>
+          <w:rFonts w:ascii="Times New Roman" w:hAnsi="Times New Roman" w:cs="Times New Roman"/>
+        </w:rPr>
+        <w:t>s</w:t>
+      </w:r>
+      <w:r>
+        <w:rPr>
+          <w:rFonts w:ascii="Times New Roman" w:hAnsi="Times New Roman" w:cs="Times New Roman"/>
+        </w:rPr>
+        <w:t xml:space="preserve"> in AD</w:t>
+      </w:r>
+      <w:r>
+        <w:rPr>
+          <w:rFonts w:ascii="Times New Roman" w:hAnsi="Times New Roman" w:cs="Times New Roman"/>
+        </w:rPr>
+        <w:t>-</w:t>
+      </w:r>
+      <w:r>
+        <w:rPr>
+          <w:rFonts w:ascii="Times New Roman" w:hAnsi="Times New Roman" w:cs="Times New Roman"/>
+        </w:rPr>
+        <w:t>signature cortical thickness over one year. Outcomes are change</w:t>
+      </w:r>
+      <w:r>
+        <w:rPr>
+          <w:rFonts w:ascii="Times New Roman" w:hAnsi="Times New Roman" w:cs="Times New Roman"/>
+        </w:rPr>
+        <w:t xml:space="preserve"> from</w:t>
+      </w:r>
+      <w:r>
+        <w:rPr>
+          <w:rFonts w:ascii="Times New Roman" w:hAnsi="Times New Roman" w:cs="Times New Roman"/>
+        </w:rPr>
+        <w:t xml:space="preserve"> baseline to Year 1</w:t>
+      </w:r>
+      <w:r>
+        <w:rPr>
+          <w:rFonts w:ascii="Times New Roman" w:hAnsi="Times New Roman" w:cs="Times New Roman"/>
+        </w:rPr>
+        <w:t xml:space="preserve"> in</w:t>
+      </w:r>
+      <w:r>
+        <w:rPr>
+          <w:rFonts w:ascii="Times New Roman" w:hAnsi="Times New Roman" w:cs="Times New Roman"/>
+        </w:rPr>
+        <w:t xml:space="preserve"> five memory variables: CVLT 20</w:t>
+      </w:r>
+      <w:r>
+        <w:rPr>
+          <w:rFonts w:ascii="Times New Roman" w:hAnsi="Times New Roman" w:cs="Times New Roman"/>
+        </w:rPr>
+        <w:t>’</w:t>
+      </w:r>
+      <w:r>
+        <w:rPr>
+          <w:rFonts w:ascii="Times New Roman" w:hAnsi="Times New Roman" w:cs="Times New Roman"/>
+        </w:rPr>
+        <w:t xml:space="preserve"> delay total correct, CVLT Recognition D</w:t>
+      </w:r>
+      <w:r>
+        <w:rPr>
+          <w:rFonts w:ascii="Times New Roman" w:hAnsi="Times New Roman" w:cs="Times New Roman"/>
+        </w:rPr>
+        <w:t>-</w:t>
+      </w:r>
+      <w:r>
+        <w:rPr>
+          <w:rFonts w:ascii="Times New Roman" w:hAnsi="Times New Roman" w:cs="Times New Roman"/>
+        </w:rPr>
+        <w:t>Prime, Benson Figure 15</w:t>
+      </w:r>
+      <w:r>
+        <w:rPr>
+          <w:rFonts w:ascii="Times New Roman" w:hAnsi="Times New Roman" w:cs="Times New Roman"/>
+        </w:rPr>
+        <w:t>’</w:t>
+      </w:r>
+      <w:r>
+        <w:rPr>
+          <w:rFonts w:ascii="Times New Roman" w:hAnsi="Times New Roman" w:cs="Times New Roman"/>
+        </w:rPr>
+        <w:t xml:space="preserve"> delay total correct, MST Proportion Correct, and Story Recall 1</w:t>
+      </w:r>
+      <w:r>
+        <w:rPr>
+          <w:rFonts w:ascii="Times New Roman" w:hAnsi="Times New Roman" w:cs="Times New Roman"/>
+        </w:rPr>
+        <w:t>-</w:t>
+      </w:r>
+      <w:r>
+        <w:rPr>
+          <w:rFonts w:ascii="Times New Roman" w:hAnsi="Times New Roman" w:cs="Times New Roman"/>
+        </w:rPr>
+        <w:t xml:space="preserve">week delay total correct. </w:t>
+      </w:r>
+      <w:r>
+        <w:rPr>
+          <w:rFonts w:ascii="Times New Roman" w:hAnsi="Times New Roman" w:cs="Times New Roman"/>
+        </w:rPr>
+        <w:t>Another</w:t>
+      </w:r>
+      <w:r>
+        <w:rPr>
+          <w:rFonts w:ascii="Times New Roman" w:hAnsi="Times New Roman" w:cs="Times New Roman"/>
+        </w:rPr>
+        <w:t xml:space="preserve"> </w:t>
+      </w:r>
+      <w:r>
+        <w:rPr>
+          <w:rFonts w:ascii="Times New Roman" w:hAnsi="Times New Roman" w:cs="Times New Roman"/>
+        </w:rPr>
+        <w:t>neuroimaging outcome is change in mean AD-signature cortical thickness.</w:t>
       </w:r>
     </w:p>
     <w:p>
-      <w:r>
-        <w:t>Other variables:</w:t>
-      </w:r>
-      <w:r>
-        <w:t xml:space="preserve"> </w:t>
-      </w:r>
-      <w:r>
-        <w:t xml:space="preserve">All models will be adjusted for </w:t>
-      </w:r>
-      <w:r>
-        <w:t>age</w:t>
-      </w:r>
-      <w:r>
-        <w:t xml:space="preserve"> and</w:t>
-      </w:r>
-      <w:r>
-        <w:t xml:space="preserve"> sex</w:t>
-      </w:r>
-      <w:r>
-        <w:t>.</w:t>
-      </w:r>
-      <w:r>
-        <w:t xml:space="preserve"> Variables</w:t>
-      </w:r>
-      <w:r>
-        <w:t xml:space="preserve"> like</w:t>
-      </w:r>
-      <w:r>
-        <w:t xml:space="preserve"> APOE</w:t>
-      </w:r>
-      <w:r>
-        <w:t xml:space="preserve"> </w:t>
-      </w:r>
-      <w:r>
-        <w:t>genotype</w:t>
-      </w:r>
-      <w:r>
-        <w:t>, BMI, blood pressure, history of hypercholesterolemia, NSAID use, CDR severity, Geriatric Depression Scale score, and immune-relevant health history conditions</w:t>
-      </w:r>
-      <w:r>
-        <w:t xml:space="preserve"> will be treated as confounders or precision variables </w:t>
-      </w:r>
-      <w:r>
-        <w:t>depending on their relationships.</w:t>
+      <w:pPr>
+        <w:spacing w:line="480" w:lineRule="auto"/>
+        <w:jc w:val="both"/>
+        <w:rPr>
+          <w:rFonts w:ascii="Times New Roman" w:hAnsi="Times New Roman" w:cs="Times New Roman"/>
+        </w:rPr>
+      </w:pPr>
+      <w:r>
+        <w:rPr>
+          <w:rFonts w:ascii="Times New Roman" w:hAnsi="Times New Roman" w:cs="Times New Roman"/>
+        </w:rPr>
+        <w:t xml:space="preserve">Hypothesis 1b: </w:t>
+      </w:r>
+      <w:r>
+        <w:rPr>
+          <w:rFonts w:ascii="Times New Roman" w:hAnsi="Times New Roman" w:cs="Times New Roman"/>
+        </w:rPr>
+        <w:t>Greater i</w:t>
+      </w:r>
+      <w:r>
+        <w:rPr>
+          <w:rFonts w:ascii="Times New Roman" w:hAnsi="Times New Roman" w:cs="Times New Roman"/>
+        </w:rPr>
+        <w:t xml:space="preserve">ncreases in inflammatory markers over time </w:t>
+      </w:r>
+      <w:r>
+        <w:rPr>
+          <w:rFonts w:ascii="Times New Roman" w:hAnsi="Times New Roman" w:cs="Times New Roman"/>
+        </w:rPr>
+        <w:t>are</w:t>
+      </w:r>
+      <w:r>
+        <w:rPr>
+          <w:rFonts w:ascii="Times New Roman" w:hAnsi="Times New Roman" w:cs="Times New Roman"/>
+        </w:rPr>
+        <w:t xml:space="preserve"> associated with greater decline</w:t>
+      </w:r>
+      <w:r>
+        <w:rPr>
+          <w:rFonts w:ascii="Times New Roman" w:hAnsi="Times New Roman" w:cs="Times New Roman"/>
+        </w:rPr>
+        <w:t>s in the same outcomes.</w:t>
       </w:r>
     </w:p>
     <w:p>
-      <w:r>
-        <w:t>Power:</w:t>
-      </w:r>
-      <w:r>
+      <w:pPr>
+        <w:spacing w:line="480" w:lineRule="auto"/>
+        <w:jc w:val="both"/>
+        <w:rPr>
+          <w:rFonts w:ascii="Times New Roman" w:hAnsi="Times New Roman" w:cs="Times New Roman"/>
+        </w:rPr>
+      </w:pPr>
+      <w:r>
+        <w:rPr>
+          <w:rFonts w:ascii="Times New Roman" w:hAnsi="Times New Roman" w:cs="Times New Roman"/>
+          <w:b/>
+          <w:bCs/>
+        </w:rPr>
+        <w:t>Predictors:</w:t>
+      </w:r>
+      <w:r>
+        <w:rPr>
+          <w:rFonts w:ascii="Times New Roman" w:hAnsi="Times New Roman" w:cs="Times New Roman"/>
+        </w:rPr>
         <w:t xml:space="preserve"> </w:t>
       </w:r>
+      <w:r>
+        <w:rPr>
+          <w:rFonts w:ascii="Times New Roman" w:hAnsi="Times New Roman" w:cs="Times New Roman"/>
+        </w:rPr>
+        <w:t>IL-6, TNF - alpha, MCP-1, Eotaxin-1</w:t>
+      </w:r>
+      <w:r>
+        <w:rPr>
+          <w:rFonts w:ascii="Times New Roman" w:hAnsi="Times New Roman" w:cs="Times New Roman"/>
+        </w:rPr>
+        <w:t xml:space="preserve"> as primary markers, others exploratory.</w:t>
+      </w:r>
     </w:p>
-    <w:p/>
     <w:p>
       <w:pPr>
-        <w:rPr>
-          <w:b/>
-          <w:bCs/>
+        <w:spacing w:line="480" w:lineRule="auto"/>
+        <w:jc w:val="both"/>
+        <w:rPr>
+          <w:rFonts w:ascii="Times New Roman" w:hAnsi="Times New Roman" w:cs="Times New Roman"/>
         </w:rPr>
       </w:pPr>
       <w:r>
         <w:rPr>
-          <w:b/>
-          <w:bCs/>
-        </w:rPr>
-        <w:t>Aim 2:</w:t>
-      </w:r>
-      <w:r>
-        <w:rPr>
-          <w:b/>
-          <w:bCs/>
-        </w:rPr>
-        <w:t xml:space="preserve"> Examine how markers of peripheral inflammation impact the relationship between AD pathology and clinical progression of aMCI.</w:t>
+          <w:rFonts w:ascii="Times New Roman" w:hAnsi="Times New Roman" w:cs="Times New Roman"/>
+          <w:b/>
+          <w:bCs/>
+        </w:rPr>
+        <w:t xml:space="preserve">Analytical </w:t>
+      </w:r>
+      <w:r>
+        <w:rPr>
+          <w:rFonts w:ascii="Times New Roman" w:hAnsi="Times New Roman" w:cs="Times New Roman"/>
+          <w:b/>
+          <w:bCs/>
+        </w:rPr>
+        <w:t>Approach:</w:t>
+      </w:r>
+      <w:r>
+        <w:rPr>
+          <w:rFonts w:ascii="Times New Roman" w:hAnsi="Times New Roman" w:cs="Times New Roman"/>
+        </w:rPr>
+        <w:t xml:space="preserve"> </w:t>
+      </w:r>
+      <w:r>
+        <w:rPr>
+          <w:rFonts w:ascii="Times New Roman" w:hAnsi="Times New Roman" w:cs="Times New Roman"/>
+        </w:rPr>
+        <w:t>M</w:t>
+      </w:r>
+      <w:r>
+        <w:rPr>
+          <w:rFonts w:ascii="Times New Roman" w:hAnsi="Times New Roman" w:cs="Times New Roman"/>
+        </w:rPr>
+        <w:t>ultiple linear regression models will be fit with</w:t>
+      </w:r>
+      <w:r>
+        <w:rPr>
+          <w:rFonts w:ascii="Times New Roman" w:hAnsi="Times New Roman" w:cs="Times New Roman"/>
+        </w:rPr>
+        <w:t xml:space="preserve"> </w:t>
+      </w:r>
+      <w:r>
+        <w:rPr>
+          <w:rFonts w:ascii="Times New Roman" w:hAnsi="Times New Roman" w:cs="Times New Roman"/>
+        </w:rPr>
+        <w:t xml:space="preserve">change </w:t>
+      </w:r>
+      <w:r>
+        <w:rPr>
+          <w:rFonts w:ascii="Times New Roman" w:hAnsi="Times New Roman" w:cs="Times New Roman"/>
+        </w:rPr>
+        <w:t>in</w:t>
+      </w:r>
+      <w:r>
+        <w:rPr>
+          <w:rFonts w:ascii="Times New Roman" w:hAnsi="Times New Roman" w:cs="Times New Roman"/>
+        </w:rPr>
+        <w:t xml:space="preserve"> outcome as the dependent variable. For Hypothesis 1a, baseline</w:t>
+      </w:r>
+      <w:r>
+        <w:rPr>
+          <w:rFonts w:ascii="Times New Roman" w:hAnsi="Times New Roman" w:cs="Times New Roman"/>
+        </w:rPr>
+        <w:t xml:space="preserve"> </w:t>
+      </w:r>
+      <w:r>
+        <w:rPr>
+          <w:rFonts w:ascii="Times New Roman" w:hAnsi="Times New Roman" w:cs="Times New Roman"/>
+        </w:rPr>
+        <w:t>inflammatory markers</w:t>
+      </w:r>
+      <w:r>
+        <w:rPr>
+          <w:rFonts w:ascii="Times New Roman" w:hAnsi="Times New Roman" w:cs="Times New Roman"/>
+        </w:rPr>
+        <w:t xml:space="preserve"> levels</w:t>
+      </w:r>
+      <w:r>
+        <w:rPr>
+          <w:rFonts w:ascii="Times New Roman" w:hAnsi="Times New Roman" w:cs="Times New Roman"/>
+        </w:rPr>
+        <w:t xml:space="preserve"> will</w:t>
+      </w:r>
+      <w:r>
+        <w:rPr>
+          <w:rFonts w:ascii="Times New Roman" w:hAnsi="Times New Roman" w:cs="Times New Roman"/>
+        </w:rPr>
+        <w:t xml:space="preserve"> be used</w:t>
+      </w:r>
+      <w:r>
+        <w:rPr>
+          <w:rFonts w:ascii="Times New Roman" w:hAnsi="Times New Roman" w:cs="Times New Roman"/>
+        </w:rPr>
+        <w:t xml:space="preserve"> as predictors </w:t>
+      </w:r>
+      <w:r>
+        <w:rPr>
+          <w:rFonts w:ascii="Times New Roman" w:hAnsi="Times New Roman" w:cs="Times New Roman"/>
+        </w:rPr>
+        <w:t>and f</w:t>
+      </w:r>
+      <w:r>
+        <w:rPr>
+          <w:rFonts w:ascii="Times New Roman" w:hAnsi="Times New Roman" w:cs="Times New Roman"/>
+        </w:rPr>
+        <w:t xml:space="preserve">or Hypothesis 1b, change in markers </w:t>
+      </w:r>
+      <w:r>
+        <w:rPr>
+          <w:rFonts w:ascii="Times New Roman" w:hAnsi="Times New Roman" w:cs="Times New Roman"/>
+        </w:rPr>
+        <w:t>will be</w:t>
+      </w:r>
+      <w:r>
+        <w:rPr>
+          <w:rFonts w:ascii="Times New Roman" w:hAnsi="Times New Roman" w:cs="Times New Roman"/>
+        </w:rPr>
+        <w:t xml:space="preserve"> predictors. </w:t>
+      </w:r>
+      <w:r>
+        <w:rPr>
+          <w:rFonts w:ascii="Times New Roman" w:hAnsi="Times New Roman" w:cs="Times New Roman"/>
+        </w:rPr>
+        <w:t xml:space="preserve">Models will be fit separately for each marker and outcome, with additional models including all four markers jointly. </w:t>
+      </w:r>
+      <w:r>
+        <w:rPr>
+          <w:rFonts w:ascii="Times New Roman" w:hAnsi="Times New Roman" w:cs="Times New Roman"/>
+        </w:rPr>
+        <w:t>Correlations among markers will be examined to assess multicollinearity and guide modeling decisions (</w:t>
+      </w:r>
+      <w:r>
+        <w:rPr>
+          <w:rFonts w:ascii="Times New Roman" w:hAnsi="Times New Roman" w:cs="Times New Roman"/>
+        </w:rPr>
+        <w:t xml:space="preserve"> e.g. </w:t>
+      </w:r>
+      <w:r>
+        <w:rPr>
+          <w:rFonts w:ascii="Times New Roman" w:hAnsi="Times New Roman" w:cs="Times New Roman"/>
+        </w:rPr>
+        <w:t>PCA i</w:t>
+      </w:r>
+      <w:r>
+        <w:rPr>
+          <w:rFonts w:ascii="Times New Roman" w:hAnsi="Times New Roman" w:cs="Times New Roman"/>
+        </w:rPr>
+        <w:t>f needed)</w:t>
       </w:r>
     </w:p>
     <w:p>
-      <w:r>
-        <w:t xml:space="preserve">Hypothesis: </w:t>
-      </w:r>
-      <w:r>
-        <w:t>T</w:t>
-      </w:r>
-      <w:r>
-        <w:t>he combination of elevated inflammatory markers and high amyloid deposition will more strongly predict decline in episodic memory and AD</w:t>
-      </w:r>
-      <w:r>
-        <w:t>-</w:t>
-      </w:r>
-      <w:r>
-        <w:t>signature cortical thickness than either variable alone</w:t>
-      </w:r>
-      <w:r>
+      <w:pPr>
+        <w:spacing w:line="480" w:lineRule="auto"/>
+        <w:jc w:val="both"/>
+        <w:rPr>
+          <w:rFonts w:ascii="Times New Roman" w:hAnsi="Times New Roman" w:cs="Times New Roman"/>
+        </w:rPr>
+      </w:pPr>
+      <w:r>
+        <w:rPr>
+          <w:rFonts w:ascii="Times New Roman" w:hAnsi="Times New Roman" w:cs="Times New Roman"/>
+          <w:b/>
+          <w:bCs/>
+        </w:rPr>
+        <w:t>Other variables:</w:t>
+      </w:r>
+      <w:r>
+        <w:rPr>
+          <w:rFonts w:ascii="Times New Roman" w:hAnsi="Times New Roman" w:cs="Times New Roman"/>
+        </w:rPr>
+        <w:t xml:space="preserve"> </w:t>
+      </w:r>
+      <w:r>
+        <w:rPr>
+          <w:rFonts w:ascii="Times New Roman" w:hAnsi="Times New Roman" w:cs="Times New Roman"/>
+        </w:rPr>
+        <w:t xml:space="preserve">All models will be adjusted for </w:t>
+      </w:r>
+      <w:r>
+        <w:rPr>
+          <w:rFonts w:ascii="Times New Roman" w:hAnsi="Times New Roman" w:cs="Times New Roman"/>
+        </w:rPr>
+        <w:t>age</w:t>
+      </w:r>
+      <w:r>
+        <w:rPr>
+          <w:rFonts w:ascii="Times New Roman" w:hAnsi="Times New Roman" w:cs="Times New Roman"/>
+        </w:rPr>
+        <w:t xml:space="preserve"> and</w:t>
+      </w:r>
+      <w:r>
+        <w:rPr>
+          <w:rFonts w:ascii="Times New Roman" w:hAnsi="Times New Roman" w:cs="Times New Roman"/>
+        </w:rPr>
+        <w:t xml:space="preserve"> sex</w:t>
+      </w:r>
+      <w:r>
+        <w:rPr>
+          <w:rFonts w:ascii="Times New Roman" w:hAnsi="Times New Roman" w:cs="Times New Roman"/>
+        </w:rPr>
         <w:t>.</w:t>
+      </w:r>
+      <w:r>
+        <w:rPr>
+          <w:rFonts w:ascii="Times New Roman" w:hAnsi="Times New Roman" w:cs="Times New Roman"/>
+        </w:rPr>
+        <w:t xml:space="preserve"> Variables like APOE </w:t>
+      </w:r>
+      <w:r>
+        <w:rPr>
+          <w:rFonts w:ascii="Times New Roman" w:hAnsi="Times New Roman" w:cs="Times New Roman"/>
+        </w:rPr>
+        <w:t>genotype</w:t>
+      </w:r>
+      <w:r>
+        <w:rPr>
+          <w:rFonts w:ascii="Times New Roman" w:hAnsi="Times New Roman" w:cs="Times New Roman"/>
+        </w:rPr>
+        <w:t xml:space="preserve">, BMI, blood pressure, hypercholesterolemia, NSAID use, CDR, Geriatric Depression Scale score, </w:t>
+      </w:r>
+      <w:r>
+        <w:rPr>
+          <w:rFonts w:ascii="Times New Roman" w:hAnsi="Times New Roman" w:cs="Times New Roman"/>
+        </w:rPr>
+        <w:lastRenderedPageBreak/>
+        <w:t>and immune-</w:t>
+      </w:r>
+      <w:r>
+        <w:rPr>
+          <w:rFonts w:ascii="Times New Roman" w:hAnsi="Times New Roman" w:cs="Times New Roman"/>
+        </w:rPr>
+        <w:t>related</w:t>
+      </w:r>
+      <w:r>
+        <w:rPr>
+          <w:rFonts w:ascii="Times New Roman" w:hAnsi="Times New Roman" w:cs="Times New Roman"/>
+        </w:rPr>
+        <w:t xml:space="preserve"> health conditions</w:t>
+      </w:r>
+      <w:r>
+        <w:rPr>
+          <w:rFonts w:ascii="Times New Roman" w:hAnsi="Times New Roman" w:cs="Times New Roman"/>
+        </w:rPr>
+        <w:t xml:space="preserve"> will be treated as confounders or precision variables</w:t>
+      </w:r>
+      <w:r>
+        <w:rPr>
+          <w:rFonts w:ascii="Times New Roman" w:hAnsi="Times New Roman" w:cs="Times New Roman"/>
+        </w:rPr>
+        <w:t>.</w:t>
+      </w:r>
+      <w:r>
+        <w:rPr>
+          <w:rFonts w:ascii="Times New Roman" w:hAnsi="Times New Roman" w:cs="Times New Roman"/>
+        </w:rPr>
+        <w:t xml:space="preserve"> A correlation analysis will assess multicollinearity</w:t>
+      </w:r>
+      <w:r>
+        <w:rPr>
+          <w:rFonts w:ascii="Times New Roman" w:hAnsi="Times New Roman" w:cs="Times New Roman"/>
+        </w:rPr>
+        <w:t xml:space="preserve"> among covariates</w:t>
+      </w:r>
+      <w:r>
+        <w:rPr>
+          <w:rFonts w:ascii="Times New Roman" w:hAnsi="Times New Roman" w:cs="Times New Roman"/>
+        </w:rPr>
+        <w:t>. Variables found to be strongly correlated with both an inflammatory marker and an outcome will be prioritized for inclusion.</w:t>
       </w:r>
     </w:p>
     <w:p>
-      <w:r>
-        <w:t>Outcomes:</w:t>
+      <w:pPr>
+        <w:spacing w:line="480" w:lineRule="auto"/>
+        <w:jc w:val="both"/>
+        <w:rPr>
+          <w:rFonts w:ascii="Times New Roman" w:hAnsi="Times New Roman" w:cs="Times New Roman"/>
+        </w:rPr>
+      </w:pPr>
+      <w:r>
+        <w:rPr>
+          <w:rFonts w:ascii="Times New Roman" w:hAnsi="Times New Roman" w:cs="Times New Roman"/>
+          <w:b/>
+          <w:bCs/>
+        </w:rPr>
+        <w:t>Power:</w:t>
+      </w:r>
+      <w:r>
+        <w:rPr>
+          <w:rFonts w:ascii="Times New Roman" w:hAnsi="Times New Roman" w:cs="Times New Roman"/>
+        </w:rPr>
+        <w:t xml:space="preserve"> </w:t>
+      </w:r>
+      <w:r>
+        <w:rPr>
+          <w:rFonts w:ascii="Times New Roman" w:hAnsi="Times New Roman" w:cs="Times New Roman"/>
+        </w:rPr>
+        <w:t>Power calculations will be conducted using F-tests for regression models</w:t>
+      </w:r>
+      <w:r>
+        <w:rPr>
+          <w:rFonts w:ascii="Times New Roman" w:hAnsi="Times New Roman" w:cs="Times New Roman"/>
+        </w:rPr>
+        <w:t xml:space="preserve"> assuming </w:t>
+      </w:r>
+      <w:r>
+        <w:rPr>
+          <w:rFonts w:ascii="Times New Roman" w:hAnsi="Times New Roman" w:cs="Times New Roman"/>
+        </w:rPr>
+        <w:t>combined sample size of 175</w:t>
+      </w:r>
+      <w:r>
+        <w:rPr>
+          <w:rFonts w:ascii="Times New Roman" w:hAnsi="Times New Roman" w:cs="Times New Roman"/>
+        </w:rPr>
+        <w:t xml:space="preserve"> (125 aMCI + 50 HC)  </w:t>
+      </w:r>
+      <w:r>
+        <w:rPr>
+          <w:rFonts w:ascii="Times New Roman" w:hAnsi="Times New Roman" w:cs="Times New Roman"/>
+        </w:rPr>
+        <w:t>participants.</w:t>
+      </w:r>
+      <w:r>
+        <w:rPr>
+          <w:rFonts w:ascii="Times New Roman" w:hAnsi="Times New Roman" w:cs="Times New Roman"/>
+        </w:rPr>
+        <w:t xml:space="preserve"> Effect size </w:t>
+      </w:r>
+      <w:r>
+        <w:rPr>
+          <w:rFonts w:ascii="Times New Roman" w:hAnsi="Times New Roman" w:cs="Times New Roman"/>
+        </w:rPr>
+        <w:t>estimates</w:t>
+      </w:r>
+      <w:r>
+        <w:rPr>
+          <w:rFonts w:ascii="Times New Roman" w:hAnsi="Times New Roman" w:cs="Times New Roman"/>
+        </w:rPr>
+        <w:t xml:space="preserve"> will be derived from preliminary findings.</w:t>
+      </w:r>
+      <w:r>
+        <w:rPr>
+          <w:rFonts w:ascii="Times New Roman" w:hAnsi="Times New Roman" w:cs="Times New Roman"/>
+        </w:rPr>
+        <w:t xml:space="preserve"> Power will be evaluated for each outcome-predictor pair.</w:t>
       </w:r>
     </w:p>
     <w:p>
-      <w:r>
-        <w:t>Predictors:</w:t>
+      <w:pPr>
+        <w:spacing w:line="480" w:lineRule="auto"/>
+        <w:jc w:val="both"/>
+        <w:rPr>
+          <w:rFonts w:ascii="Times New Roman" w:hAnsi="Times New Roman" w:cs="Times New Roman"/>
+          <w:b/>
+          <w:bCs/>
+        </w:rPr>
+      </w:pPr>
+      <w:r>
+        <w:rPr>
+          <w:rFonts w:ascii="Times New Roman" w:hAnsi="Times New Roman" w:cs="Times New Roman"/>
+          <w:b/>
+          <w:bCs/>
+        </w:rPr>
+        <w:t>Aim 2:</w:t>
+      </w:r>
+      <w:r>
+        <w:rPr>
+          <w:rFonts w:ascii="Times New Roman" w:hAnsi="Times New Roman" w:cs="Times New Roman"/>
+          <w:b/>
+          <w:bCs/>
+        </w:rPr>
+        <w:t xml:space="preserve"> Examine how markers of peripheral inflammation impact the relationship between AD pathology and clinical progression of aMCI.</w:t>
       </w:r>
     </w:p>
     <w:p>
-      <w:r>
-        <w:t xml:space="preserve">Approach: </w:t>
+      <w:pPr>
+        <w:spacing w:line="480" w:lineRule="auto"/>
+        <w:jc w:val="both"/>
+        <w:rPr>
+          <w:rFonts w:ascii="Times New Roman" w:hAnsi="Times New Roman" w:cs="Times New Roman"/>
+        </w:rPr>
+      </w:pPr>
+      <w:r>
+        <w:rPr>
+          <w:rFonts w:ascii="Times New Roman" w:hAnsi="Times New Roman" w:cs="Times New Roman"/>
+          <w:b/>
+          <w:bCs/>
+        </w:rPr>
+        <w:t>Hypothesis</w:t>
+      </w:r>
+      <w:r>
+        <w:rPr>
+          <w:rFonts w:ascii="Times New Roman" w:hAnsi="Times New Roman" w:cs="Times New Roman"/>
+          <w:b/>
+          <w:bCs/>
+        </w:rPr>
+        <w:t xml:space="preserve"> and </w:t>
+      </w:r>
+      <w:r>
+        <w:rPr>
+          <w:rFonts w:ascii="Times New Roman" w:hAnsi="Times New Roman" w:cs="Times New Roman"/>
+          <w:b/>
+          <w:bCs/>
+        </w:rPr>
+        <w:t>outcomes</w:t>
+      </w:r>
+      <w:r>
+        <w:rPr>
+          <w:rFonts w:ascii="Times New Roman" w:hAnsi="Times New Roman" w:cs="Times New Roman"/>
+          <w:b/>
+          <w:bCs/>
+        </w:rPr>
+        <w:t xml:space="preserve">: </w:t>
+      </w:r>
+      <w:r>
+        <w:rPr>
+          <w:rFonts w:ascii="Times New Roman" w:hAnsi="Times New Roman" w:cs="Times New Roman"/>
+        </w:rPr>
+        <w:t>A</w:t>
+      </w:r>
+      <w:r>
+        <w:rPr>
+          <w:rFonts w:ascii="Times New Roman" w:hAnsi="Times New Roman" w:cs="Times New Roman"/>
+        </w:rPr>
+        <w:t xml:space="preserve">myloid deposition (measured via </w:t>
+      </w:r>
+      <w:proofErr w:type="spellStart"/>
+      <w:r>
+        <w:rPr>
+          <w:rFonts w:ascii="Times New Roman" w:hAnsi="Times New Roman" w:cs="Times New Roman"/>
+        </w:rPr>
+        <w:t>Florbetapir</w:t>
+      </w:r>
+      <w:proofErr w:type="spellEnd"/>
+      <w:r>
+        <w:rPr>
+          <w:rFonts w:ascii="Times New Roman" w:hAnsi="Times New Roman" w:cs="Times New Roman"/>
+        </w:rPr>
+        <w:t>-</w:t>
+      </w:r>
+      <w:r>
+        <w:rPr>
+          <w:rFonts w:ascii="Times New Roman" w:hAnsi="Times New Roman" w:cs="Times New Roman"/>
+        </w:rPr>
+        <w:t>PET as a continuous SUVR) moderates the relationship between inflammation and c</w:t>
+      </w:r>
+      <w:r>
+        <w:rPr>
+          <w:rFonts w:ascii="Times New Roman" w:hAnsi="Times New Roman" w:cs="Times New Roman"/>
+        </w:rPr>
+        <w:t>ognitive decline</w:t>
+      </w:r>
+      <w:r>
+        <w:rPr>
+          <w:rFonts w:ascii="Times New Roman" w:hAnsi="Times New Roman" w:cs="Times New Roman"/>
+        </w:rPr>
+        <w:t xml:space="preserve"> over one year</w:t>
+      </w:r>
+      <w:r>
+        <w:rPr>
+          <w:rFonts w:ascii="Times New Roman" w:hAnsi="Times New Roman" w:cs="Times New Roman"/>
+        </w:rPr>
+        <w:t xml:space="preserve"> such that individuals with both higher inflammation and greater amyloid burden will show the greatest decline in episodic memory and cortical thickness. </w:t>
+      </w:r>
+      <w:r>
+        <w:rPr>
+          <w:rFonts w:ascii="Times New Roman" w:hAnsi="Times New Roman" w:cs="Times New Roman"/>
+        </w:rPr>
+        <w:t xml:space="preserve">The outcomes are the same change scores </w:t>
+      </w:r>
+      <w:r>
+        <w:rPr>
+          <w:rFonts w:ascii="Times New Roman" w:hAnsi="Times New Roman" w:cs="Times New Roman"/>
+        </w:rPr>
+        <w:t>as</w:t>
+      </w:r>
+      <w:r>
+        <w:rPr>
+          <w:rFonts w:ascii="Times New Roman" w:hAnsi="Times New Roman" w:cs="Times New Roman"/>
+        </w:rPr>
+        <w:t xml:space="preserve"> in Aim 1.</w:t>
       </w:r>
     </w:p>
     <w:p>
-      <w:r>
-        <w:t>Other variables:</w:t>
+      <w:pPr>
+        <w:spacing w:line="480" w:lineRule="auto"/>
+        <w:jc w:val="both"/>
+        <w:rPr>
+          <w:rFonts w:ascii="Times New Roman" w:hAnsi="Times New Roman" w:cs="Times New Roman"/>
+          <w:b/>
+          <w:bCs/>
+        </w:rPr>
+      </w:pPr>
+      <w:r>
+        <w:rPr>
+          <w:rFonts w:ascii="Times New Roman" w:hAnsi="Times New Roman" w:cs="Times New Roman"/>
+          <w:b/>
+          <w:bCs/>
+        </w:rPr>
+        <w:t>Predictor</w:t>
+      </w:r>
+      <w:r>
+        <w:rPr>
+          <w:rFonts w:ascii="Times New Roman" w:hAnsi="Times New Roman" w:cs="Times New Roman"/>
+          <w:b/>
+          <w:bCs/>
+        </w:rPr>
+        <w:t>s</w:t>
+      </w:r>
+      <w:r>
+        <w:rPr>
+          <w:rFonts w:ascii="Times New Roman" w:hAnsi="Times New Roman" w:cs="Times New Roman"/>
+          <w:b/>
+          <w:bCs/>
+        </w:rPr>
+        <w:t>:</w:t>
+      </w:r>
+      <w:r>
+        <w:rPr>
+          <w:rFonts w:ascii="Times New Roman" w:hAnsi="Times New Roman" w:cs="Times New Roman"/>
+        </w:rPr>
+        <w:t xml:space="preserve"> </w:t>
+      </w:r>
+      <w:r>
+        <w:rPr>
+          <w:rFonts w:ascii="Times New Roman" w:hAnsi="Times New Roman" w:cs="Times New Roman"/>
+        </w:rPr>
+        <w:t>Inflammatory markers, amyloid PET SUVR, and their interaction.</w:t>
       </w:r>
     </w:p>
     <w:p>
-      <w:r>
+      <w:pPr>
+        <w:spacing w:line="480" w:lineRule="auto"/>
+        <w:jc w:val="both"/>
+        <w:rPr>
+          <w:rFonts w:ascii="Times New Roman" w:hAnsi="Times New Roman" w:cs="Times New Roman"/>
+        </w:rPr>
+      </w:pPr>
+      <w:r>
+        <w:rPr>
+          <w:rFonts w:ascii="Times New Roman" w:hAnsi="Times New Roman" w:cs="Times New Roman"/>
+          <w:b/>
+          <w:bCs/>
+        </w:rPr>
+        <w:t xml:space="preserve">Analytical </w:t>
+      </w:r>
+      <w:r>
+        <w:rPr>
+          <w:rFonts w:ascii="Times New Roman" w:hAnsi="Times New Roman" w:cs="Times New Roman"/>
+          <w:b/>
+          <w:bCs/>
+        </w:rPr>
+        <w:t>Approach:</w:t>
+      </w:r>
+      <w:r>
+        <w:rPr>
+          <w:rFonts w:ascii="Times New Roman" w:hAnsi="Times New Roman" w:cs="Times New Roman"/>
+        </w:rPr>
+        <w:t xml:space="preserve"> </w:t>
+      </w:r>
+      <w:r>
+        <w:rPr>
+          <w:rFonts w:ascii="Times New Roman" w:hAnsi="Times New Roman" w:cs="Times New Roman"/>
+        </w:rPr>
+        <w:t>Multiple linear regression models will be fit for each outcome, including</w:t>
+      </w:r>
+      <w:r>
+        <w:rPr>
+          <w:rFonts w:ascii="Times New Roman" w:hAnsi="Times New Roman" w:cs="Times New Roman"/>
+        </w:rPr>
+        <w:t xml:space="preserve"> </w:t>
+      </w:r>
+      <w:r>
+        <w:rPr>
+          <w:rFonts w:ascii="Times New Roman" w:hAnsi="Times New Roman" w:cs="Times New Roman"/>
+        </w:rPr>
+        <w:t xml:space="preserve">main effect of </w:t>
+      </w:r>
+      <w:r>
+        <w:rPr>
+          <w:rFonts w:ascii="Times New Roman" w:hAnsi="Times New Roman" w:cs="Times New Roman"/>
+        </w:rPr>
+        <w:t xml:space="preserve">each </w:t>
+      </w:r>
+      <w:r>
+        <w:rPr>
+          <w:rFonts w:ascii="Times New Roman" w:hAnsi="Times New Roman" w:cs="Times New Roman"/>
+        </w:rPr>
+        <w:t>inflammatory marker</w:t>
+      </w:r>
+      <w:r>
+        <w:rPr>
+          <w:rFonts w:ascii="Times New Roman" w:hAnsi="Times New Roman" w:cs="Times New Roman"/>
+        </w:rPr>
+        <w:t xml:space="preserve"> and </w:t>
+      </w:r>
+      <w:r>
+        <w:rPr>
+          <w:rFonts w:ascii="Times New Roman" w:hAnsi="Times New Roman" w:cs="Times New Roman"/>
+        </w:rPr>
+        <w:t>amyloid SUVR</w:t>
+      </w:r>
+      <w:r>
+        <w:rPr>
+          <w:rFonts w:ascii="Times New Roman" w:hAnsi="Times New Roman" w:cs="Times New Roman"/>
+        </w:rPr>
+        <w:t xml:space="preserve"> plus </w:t>
+      </w:r>
+      <w:r>
+        <w:rPr>
+          <w:rFonts w:ascii="Times New Roman" w:hAnsi="Times New Roman" w:cs="Times New Roman"/>
+        </w:rPr>
+        <w:t>their</w:t>
+      </w:r>
+      <w:r>
+        <w:rPr>
+          <w:rFonts w:ascii="Times New Roman" w:hAnsi="Times New Roman" w:cs="Times New Roman"/>
+        </w:rPr>
+        <w:t xml:space="preserve"> </w:t>
+      </w:r>
+      <w:r>
+        <w:rPr>
+          <w:rFonts w:ascii="Times New Roman" w:hAnsi="Times New Roman" w:cs="Times New Roman"/>
+        </w:rPr>
+        <w:t>interaction</w:t>
+      </w:r>
+      <w:r>
+        <w:rPr>
+          <w:rFonts w:ascii="Times New Roman" w:hAnsi="Times New Roman" w:cs="Times New Roman"/>
+        </w:rPr>
+        <w:t xml:space="preserve"> </w:t>
+      </w:r>
+      <w:r>
+        <w:rPr>
+          <w:rFonts w:ascii="Times New Roman" w:hAnsi="Times New Roman" w:cs="Times New Roman"/>
+        </w:rPr>
+        <w:t xml:space="preserve">term. As an exploratory alternative, a dichotomous amyloid-positivity cutoff (per published SUVR thresholds) will be examined if evidence for non-linearity in the SUVR-outcome </w:t>
+      </w:r>
+      <w:r>
+        <w:rPr>
+          <w:rFonts w:ascii="Times New Roman" w:hAnsi="Times New Roman" w:cs="Times New Roman"/>
+        </w:rPr>
+        <w:t>relationship arises</w:t>
+      </w:r>
+      <w:r>
+        <w:rPr>
+          <w:rFonts w:ascii="Times New Roman" w:hAnsi="Times New Roman" w:cs="Times New Roman"/>
+        </w:rPr>
+        <w:t>.</w:t>
+      </w:r>
+    </w:p>
+    <w:p>
+      <w:pPr>
+        <w:spacing w:line="480" w:lineRule="auto"/>
+        <w:jc w:val="both"/>
+        <w:rPr>
+          <w:rFonts w:ascii="Times New Roman" w:hAnsi="Times New Roman" w:cs="Times New Roman"/>
+        </w:rPr>
+      </w:pPr>
+      <w:r>
+        <w:rPr>
+          <w:rFonts w:ascii="Times New Roman" w:hAnsi="Times New Roman" w:cs="Times New Roman"/>
+          <w:b/>
+          <w:bCs/>
+        </w:rPr>
+        <w:t>Other variables:</w:t>
+      </w:r>
+      <w:r>
+        <w:rPr>
+          <w:rFonts w:ascii="Times New Roman" w:hAnsi="Times New Roman" w:cs="Times New Roman"/>
+        </w:rPr>
+        <w:t xml:space="preserve"> same as Aim 1.</w:t>
+      </w:r>
+    </w:p>
+    <w:p>
+      <w:pPr>
+        <w:spacing w:line="480" w:lineRule="auto"/>
+        <w:jc w:val="both"/>
+        <w:rPr>
+          <w:rFonts w:ascii="Times New Roman" w:hAnsi="Times New Roman" w:cs="Times New Roman"/>
+        </w:rPr>
+      </w:pPr>
+      <w:r>
+        <w:rPr>
+          <w:rFonts w:ascii="Times New Roman" w:hAnsi="Times New Roman" w:cs="Times New Roman"/>
+          <w:b/>
+          <w:bCs/>
+        </w:rPr>
         <w:t>Power:</w:t>
       </w:r>
+      <w:r>
+        <w:rPr>
+          <w:rFonts w:ascii="Times New Roman" w:hAnsi="Times New Roman" w:cs="Times New Roman"/>
+        </w:rPr>
+        <w:t xml:space="preserve"> </w:t>
+      </w:r>
+      <w:r>
+        <w:rPr>
+          <w:rFonts w:ascii="Times New Roman" w:hAnsi="Times New Roman" w:cs="Times New Roman"/>
+        </w:rPr>
+        <w:t>Power calculations will focus on detecting the interaction effect.</w:t>
+      </w:r>
     </w:p>
-    <w:p/>
     <w:sectPr>
       <w:pgSz w:w="12240" w:h="15840"/>
       <w:pgMar w:top="1440" w:right="1440" w:bottom="1440" w:left="1440" w:header="720" w:footer="720" w:gutter="0"/>
@@ -907,6 +1683,7 @@
   <w:style w:type="character" w:default="1" w:styleId="DefaultParagraphFont">
     <w:name w:val="Default Paragraph Font"/>
     <w:uiPriority w:val="1"/>
+    <w:semiHidden/>
     <w:unhideWhenUsed/>
   </w:style>
   <w:style w:type="table" w:default="1" w:styleId="TableNormal">

</xml_diff>